<commit_message>
feat(backend): update master word and excel templates with all 6 question types
</commit_message>
<xml_diff>
--- a/apps/backend/src/modules/question-bank/templates/default-template-soal.docx
+++ b/apps/backend/src/modules/question-bank/templates/default-template-soal.docx
@@ -33,7 +33,7 @@
           <w:sz w:val="22"/>
           <w:szCs w:val="22"/>
         </w:rPr>
-        <w:t xml:space="preserve">MASTER TEMPLATE SOAL UJIAN (MICROSOFT WORD)</w:t>
+        <w:t xml:space="preserve">MASTER TEMPLATE SOAL UJIAN MULTI-TIPE (MICROSOFT WORD)</w:t>
       </w:r>
     </w:p>
     <w:tbl>
@@ -81,7 +81,7 @@
                 <w:sz w:val="20"/>
                 <w:szCs w:val="20"/>
               </w:rPr>
-              <w:t xml:space="preserve">📌 PETUNJUK PENULISAN SOAL (FORMAT NASKAH ALAMI):</w:t>
+              <w:t xml:space="preserve">📌 PETUNJUK PENULISAN SOAL MULTI-TIPE (FORMAT NASKAH ALAMI):</w:t>
             </w:r>
           </w:p>
           <w:p>
@@ -95,7 +95,23 @@
                 <w:sz w:val="18"/>
                 <w:szCs w:val="18"/>
               </w:rPr>
-              <w:t xml:space="preserve">• Nomor Soal: Awali dengan [SOAL 1], [SOAL 2], atau nomor standar (1., 2.).</w:t>
+              <w:t xml:space="preserve">• Awali setiap butir soal dengan: [SOAL 1], [SOAL 2], atau 1., 2.</w:t>
+            </w:r>
+          </w:p>
+          <w:p>
+            <w:pPr>
+              <w:spacing w:after="60"/>
+            </w:pPr>
+            <w:r>
+              <w:rPr>
+                <w:rFonts w:ascii="Arial" w:cs="Arial" w:eastAsia="Arial" w:hAnsi="Arial"/>
+                <w:b/>
+                <w:bCs/>
+                <w:color w:val="2563EB"/>
+                <w:sz w:val="18"/>
+                <w:szCs w:val="18"/>
+              </w:rPr>
+              <w:t xml:space="preserve">• Tipe Soal (Opsional): Tuliskan tag TIPE: [PILIHAN_GANDA / PG_KOMPLEKS / BENAR_SALAH / ISIAN_SINGKAT / MENJODOHKAN / ESAI]. Parser akan otomatis mendeteksi jika tag tidak ditulis.</w:t>
             </w:r>
           </w:p>
           <w:p>
@@ -109,7 +125,7 @@
                 <w:sz w:val="18"/>
                 <w:szCs w:val="18"/>
               </w:rPr>
-              <w:t xml:space="preserve">• Teks Pertanyaan: Tuliskan pertanyaan tepat di bawah nomor soal. Gambar/diagram dapat langsung di-paste di sini.</w:t>
+              <w:t xml:space="preserve">• Pilihan Ganda Biasa: Opsi A s.d. E, baris KUNCI: [A/B/C/D/E].</w:t>
             </w:r>
           </w:p>
           <w:p>
@@ -123,7 +139,7 @@
                 <w:sz w:val="18"/>
                 <w:szCs w:val="18"/>
               </w:rPr>
-              <w:t xml:space="preserve">• Pilihan Opsi: Tuliskan opsi A s.d. E diawali huruf kapital (contoh: A. Pilihan satu).</w:t>
+              <w:t xml:space="preserve">• PG Kompleks: Opsi A s.d. E, baris KUNCI: A, B, D (kunci dipisahkan koma).</w:t>
             </w:r>
           </w:p>
           <w:p>
@@ -133,13 +149,53 @@
             <w:r>
               <w:rPr>
                 <w:rFonts w:ascii="Arial" w:cs="Arial" w:eastAsia="Arial" w:hAnsi="Arial"/>
-                <w:b/>
-                <w:bCs/>
-                <w:color w:val="1E3A8A"/>
+                <w:color w:val="334155"/>
                 <w:sz w:val="18"/>
                 <w:szCs w:val="18"/>
               </w:rPr>
-              <w:t xml:space="preserve">• Kunci Jawaban: Tuliskan baris KUNCI: [A/B/C/D/E] di bawah opsi jawaban.</w:t>
+              <w:t xml:space="preserve">• Benar / Salah: Baris KUNCI: BENAR atau KUNCI: SALAH (opsi tidak perlu ditulis manual).</w:t>
+            </w:r>
+          </w:p>
+          <w:p>
+            <w:pPr>
+              <w:spacing w:after="60"/>
+            </w:pPr>
+            <w:r>
+              <w:rPr>
+                <w:rFonts w:ascii="Arial" w:cs="Arial" w:eastAsia="Arial" w:hAnsi="Arial"/>
+                <w:color w:val="334155"/>
+                <w:sz w:val="18"/>
+                <w:szCs w:val="18"/>
+              </w:rPr>
+              <w:t xml:space="preserve">• Isian Singkat: Baris KUNCI: [kata kunci jawaban] (opsi tidak perlu ditulis).</w:t>
+            </w:r>
+          </w:p>
+          <w:p>
+            <w:pPr>
+              <w:spacing w:after="60"/>
+            </w:pPr>
+            <w:r>
+              <w:rPr>
+                <w:rFonts w:ascii="Arial" w:cs="Arial" w:eastAsia="Arial" w:hAnsi="Arial"/>
+                <w:color w:val="334155"/>
+                <w:sz w:val="18"/>
+                <w:szCs w:val="18"/>
+              </w:rPr>
+              <w:t xml:space="preserve">• Menjodohkan: Tuliskan pasangan opsi dengan tanda panah: A. Pernyataan -&gt; Pasangan.</w:t>
+            </w:r>
+          </w:p>
+          <w:p>
+            <w:pPr>
+              <w:spacing w:after="60"/>
+            </w:pPr>
+            <w:r>
+              <w:rPr>
+                <w:rFonts w:ascii="Arial" w:cs="Arial" w:eastAsia="Arial" w:hAnsi="Arial"/>
+                <w:color w:val="334155"/>
+                <w:sz w:val="18"/>
+                <w:szCs w:val="18"/>
+              </w:rPr>
+              <w:t xml:space="preserve">• Esai / Uraian: Tuliskan pertanyaan dan pembahasan, tanpa opsi dan kunci jawaban.</w:t>
             </w:r>
           </w:p>
           <w:p>
@@ -153,7 +209,7 @@
                 <w:sz w:val="18"/>
                 <w:szCs w:val="18"/>
               </w:rPr>
-              <w:t xml:space="preserve">• Metadata Opsional: Tambahkan PEMBAHASAN: [teks] dan KESULITAN: [MUDAH/SEDANG/SULIT] (default: SEDANG).</w:t>
+              <w:t xml:space="preserve">• Metadata: Tambahkan PEMBAHASAN: [teks] dan KESULITAN: [MUDAH/SEDANG/SULIT] (default: SEDANG). Gambar diagram dapat langsung di-paste.</w:t>
             </w:r>
           </w:p>
         </w:tc>
@@ -166,7 +222,7 @@
     </w:p>
     <w:p>
       <w:pPr>
-        <w:spacing w:after="80" w:before="100"/>
+        <w:spacing w:after="80" w:before="120"/>
       </w:pPr>
       <w:r>
         <w:rPr>
@@ -190,59 +246,59 @@
           <w:sz w:val="21"/>
           <w:szCs w:val="21"/>
         </w:rPr>
-        <w:t xml:space="preserve">Perangkat lunak berikut ini yang berfungsi sebagai sistem operasi pada komputer adalah...</w:t>
-      </w:r>
-    </w:p>
-    <w:p>
-      <w:pPr>
-        <w:spacing w:after="60"/>
-      </w:pPr>
-      <w:r>
-        <w:rPr>
-          <w:rFonts w:ascii="Arial" w:cs="Arial" w:eastAsia="Arial" w:hAnsi="Arial"/>
-          <w:sz w:val="20"/>
-          <w:szCs w:val="20"/>
-        </w:rPr>
-        <w:t xml:space="preserve">A. Microsoft Word</w:t>
-      </w:r>
-    </w:p>
-    <w:p>
-      <w:pPr>
-        <w:spacing w:after="60"/>
-      </w:pPr>
-      <w:r>
-        <w:rPr>
-          <w:rFonts w:ascii="Arial" w:cs="Arial" w:eastAsia="Arial" w:hAnsi="Arial"/>
-          <w:sz w:val="20"/>
-          <w:szCs w:val="20"/>
-        </w:rPr>
-        <w:t xml:space="preserve">B. Microsoft Windows</w:t>
-      </w:r>
-    </w:p>
-    <w:p>
-      <w:pPr>
-        <w:spacing w:after="60"/>
-      </w:pPr>
-      <w:r>
-        <w:rPr>
-          <w:rFonts w:ascii="Arial" w:cs="Arial" w:eastAsia="Arial" w:hAnsi="Arial"/>
-          <w:sz w:val="20"/>
-          <w:szCs w:val="20"/>
-        </w:rPr>
-        <w:t xml:space="preserve">C. Google Chrome</w:t>
-      </w:r>
-    </w:p>
-    <w:p>
-      <w:pPr>
-        <w:spacing w:after="60"/>
-      </w:pPr>
-      <w:r>
-        <w:rPr>
-          <w:rFonts w:ascii="Arial" w:cs="Arial" w:eastAsia="Arial" w:hAnsi="Arial"/>
-          <w:sz w:val="20"/>
-          <w:szCs w:val="20"/>
-        </w:rPr>
-        <w:t xml:space="preserve">D. Adobe Photoshop</w:t>
+        <w:t xml:space="preserve">Ibu kota negara Indonesia saat ini berlokasi di Provinsi Kalimantan Timur dengan nama...</w:t>
+      </w:r>
+    </w:p>
+    <w:p>
+      <w:pPr>
+        <w:spacing w:after="60"/>
+      </w:pPr>
+      <w:r>
+        <w:rPr>
+          <w:rFonts w:ascii="Arial" w:cs="Arial" w:eastAsia="Arial" w:hAnsi="Arial"/>
+          <w:sz w:val="20"/>
+          <w:szCs w:val="20"/>
+        </w:rPr>
+        <w:t xml:space="preserve">A. Jakarta</w:t>
+      </w:r>
+    </w:p>
+    <w:p>
+      <w:pPr>
+        <w:spacing w:after="60"/>
+      </w:pPr>
+      <w:r>
+        <w:rPr>
+          <w:rFonts w:ascii="Arial" w:cs="Arial" w:eastAsia="Arial" w:hAnsi="Arial"/>
+          <w:sz w:val="20"/>
+          <w:szCs w:val="20"/>
+        </w:rPr>
+        <w:t xml:space="preserve">B. Surabaya</w:t>
+      </w:r>
+    </w:p>
+    <w:p>
+      <w:pPr>
+        <w:spacing w:after="60"/>
+      </w:pPr>
+      <w:r>
+        <w:rPr>
+          <w:rFonts w:ascii="Arial" w:cs="Arial" w:eastAsia="Arial" w:hAnsi="Arial"/>
+          <w:sz w:val="20"/>
+          <w:szCs w:val="20"/>
+        </w:rPr>
+        <w:t xml:space="preserve">C. Nusantara</w:t>
+      </w:r>
+    </w:p>
+    <w:p>
+      <w:pPr>
+        <w:spacing w:after="60"/>
+      </w:pPr>
+      <w:r>
+        <w:rPr>
+          <w:rFonts w:ascii="Arial" w:cs="Arial" w:eastAsia="Arial" w:hAnsi="Arial"/>
+          <w:sz w:val="20"/>
+          <w:szCs w:val="20"/>
+        </w:rPr>
+        <w:t xml:space="preserve">D. Medan</w:t>
       </w:r>
     </w:p>
     <w:p>
@@ -255,7 +311,7 @@
           <w:sz w:val="20"/>
           <w:szCs w:val="20"/>
         </w:rPr>
-        <w:t xml:space="preserve">E. Visual Studio Code</w:t>
+        <w:t xml:space="preserve">E. Makassar</w:t>
       </w:r>
     </w:p>
     <w:p>
@@ -282,7 +338,7 @@
           <w:sz w:val="20"/>
           <w:szCs w:val="20"/>
         </w:rPr>
-        <w:t xml:space="preserve">B</w:t>
+        <w:t xml:space="preserve">C</w:t>
       </w:r>
     </w:p>
     <w:p>
@@ -307,12 +363,12 @@
           <w:sz w:val="19"/>
           <w:szCs w:val="19"/>
         </w:rPr>
-        <w:t xml:space="preserve">Microsoft Windows merupakan sistem operasi yang mengelola sumber daya perangkat keras dan perangkat lunak.</w:t>
-      </w:r>
-    </w:p>
-    <w:p>
-      <w:pPr>
-        <w:spacing w:after="300"/>
+        <w:t xml:space="preserve">Ibu Kota Nusantara (IKN) berlokasi di wilayah Kabupaten Penajam Paser Utara dan Kutai Kartanegara, Kalimantan Timur.</w:t>
+      </w:r>
+    </w:p>
+    <w:p>
+      <w:pPr>
+        <w:spacing w:after="260"/>
       </w:pPr>
       <w:r>
         <w:rPr>
@@ -337,7 +393,7 @@
     </w:p>
     <w:p>
       <w:pPr>
-        <w:spacing w:after="300"/>
+        <w:spacing w:after="260"/>
         <w:jc w:val="center"/>
       </w:pPr>
       <w:r>
@@ -365,6 +421,22 @@
     </w:p>
     <w:p>
       <w:pPr>
+        <w:spacing w:after="80"/>
+      </w:pPr>
+      <w:r>
+        <w:rPr>
+          <w:rFonts w:ascii="Arial" w:cs="Arial" w:eastAsia="Arial" w:hAnsi="Arial"/>
+          <w:b/>
+          <w:bCs/>
+          <w:color w:val="7C3AED"/>
+          <w:sz w:val="19"/>
+          <w:szCs w:val="19"/>
+        </w:rPr>
+        <w:t xml:space="preserve">TIPE: PG_KOMPLEKS</w:t>
+      </w:r>
+    </w:p>
+    <w:p>
+      <w:pPr>
         <w:spacing w:after="120"/>
       </w:pPr>
       <w:r>
@@ -373,59 +445,46 @@
           <w:sz w:val="21"/>
           <w:szCs w:val="21"/>
         </w:rPr>
-        <w:t xml:space="preserve">Jika diketahui persamaan kuadrat 2x² + 5x - 3 = 0, maka nilai diskriminan (D) dari persamaan tersebut adalah...</w:t>
-      </w:r>
-    </w:p>
-    <w:p>
-      <w:pPr>
-        <w:spacing w:after="60"/>
-      </w:pPr>
-      <w:r>
-        <w:rPr>
-          <w:rFonts w:ascii="Arial" w:cs="Arial" w:eastAsia="Arial" w:hAnsi="Arial"/>
-          <w:sz w:val="20"/>
-          <w:szCs w:val="20"/>
-        </w:rPr>
-        <w:t xml:space="preserve">A. 1</w:t>
-      </w:r>
-    </w:p>
-    <w:p>
-      <w:pPr>
-        <w:spacing w:after="60"/>
-      </w:pPr>
-      <w:r>
-        <w:rPr>
-          <w:rFonts w:ascii="Arial" w:cs="Arial" w:eastAsia="Arial" w:hAnsi="Arial"/>
-          <w:sz w:val="20"/>
-          <w:szCs w:val="20"/>
-        </w:rPr>
-        <w:t xml:space="preserve">B. 49</w:t>
-      </w:r>
-    </w:p>
-    <w:p>
-      <w:pPr>
-        <w:spacing w:after="60"/>
-      </w:pPr>
-      <w:r>
-        <w:rPr>
-          <w:rFonts w:ascii="Arial" w:cs="Arial" w:eastAsia="Arial" w:hAnsi="Arial"/>
-          <w:sz w:val="20"/>
-          <w:szCs w:val="20"/>
-        </w:rPr>
-        <w:t xml:space="preserve">C. 25</w:t>
-      </w:r>
-    </w:p>
-    <w:p>
-      <w:pPr>
-        <w:spacing w:after="60"/>
-      </w:pPr>
-      <w:r>
-        <w:rPr>
-          <w:rFonts w:ascii="Arial" w:cs="Arial" w:eastAsia="Arial" w:hAnsi="Arial"/>
-          <w:sz w:val="20"/>
-          <w:szCs w:val="20"/>
-        </w:rPr>
-        <w:t xml:space="preserve">D. 36</w:t>
+        <w:t xml:space="preserve">Manakah dari bahasa pemrograman berikut ini yang umumnya dieksekusi menggunakan interpreter (diinterpretasi)?</w:t>
+      </w:r>
+    </w:p>
+    <w:p>
+      <w:pPr>
+        <w:spacing w:after="60"/>
+      </w:pPr>
+      <w:r>
+        <w:rPr>
+          <w:rFonts w:ascii="Arial" w:cs="Arial" w:eastAsia="Arial" w:hAnsi="Arial"/>
+          <w:sz w:val="20"/>
+          <w:szCs w:val="20"/>
+        </w:rPr>
+        <w:t xml:space="preserve">A. Python</w:t>
+      </w:r>
+    </w:p>
+    <w:p>
+      <w:pPr>
+        <w:spacing w:after="60"/>
+      </w:pPr>
+      <w:r>
+        <w:rPr>
+          <w:rFonts w:ascii="Arial" w:cs="Arial" w:eastAsia="Arial" w:hAnsi="Arial"/>
+          <w:sz w:val="20"/>
+          <w:szCs w:val="20"/>
+        </w:rPr>
+        <w:t xml:space="preserve">B. JavaScript</w:t>
+      </w:r>
+    </w:p>
+    <w:p>
+      <w:pPr>
+        <w:spacing w:after="60"/>
+      </w:pPr>
+      <w:r>
+        <w:rPr>
+          <w:rFonts w:ascii="Arial" w:cs="Arial" w:eastAsia="Arial" w:hAnsi="Arial"/>
+          <w:sz w:val="20"/>
+          <w:szCs w:val="20"/>
+        </w:rPr>
+        <w:t xml:space="preserve">C. C++</w:t>
       </w:r>
     </w:p>
     <w:p>
@@ -438,7 +497,7 @@
           <w:sz w:val="20"/>
           <w:szCs w:val="20"/>
         </w:rPr>
-        <w:t xml:space="preserve">E. -1</w:t>
+        <w:t xml:space="preserve">D. Ruby</w:t>
       </w:r>
     </w:p>
     <w:p>
@@ -465,7 +524,7 @@
           <w:sz w:val="20"/>
           <w:szCs w:val="20"/>
         </w:rPr>
-        <w:t xml:space="preserve">B</w:t>
+        <w:t xml:space="preserve">A, B, D</w:t>
       </w:r>
     </w:p>
     <w:p>
@@ -490,12 +549,12 @@
           <w:sz w:val="19"/>
           <w:szCs w:val="19"/>
         </w:rPr>
-        <w:t xml:space="preserve">Rumus diskriminan D = b² - 4ac. Nilai D = (5)² - 4(2)(-3) = 25 + 24 = 49.</w:t>
-      </w:r>
-    </w:p>
-    <w:p>
-      <w:pPr>
-        <w:spacing w:after="300"/>
+        <w:t xml:space="preserve">Python, JavaScript, dan Ruby dieksekusi oleh interpreter runtime, sedangkan C++ dikompilasi ke machine code.</w:t>
+      </w:r>
+    </w:p>
+    <w:p>
+      <w:pPr>
+        <w:spacing w:after="260"/>
       </w:pPr>
       <w:r>
         <w:rPr>
@@ -520,7 +579,7 @@
     </w:p>
     <w:p>
       <w:pPr>
-        <w:spacing w:after="300"/>
+        <w:spacing w:after="260"/>
         <w:jc w:val="center"/>
       </w:pPr>
       <w:r>
@@ -548,6 +607,22 @@
     </w:p>
     <w:p>
       <w:pPr>
+        <w:spacing w:after="80"/>
+      </w:pPr>
+      <w:r>
+        <w:rPr>
+          <w:rFonts w:ascii="Arial" w:cs="Arial" w:eastAsia="Arial" w:hAnsi="Arial"/>
+          <w:b/>
+          <w:bCs/>
+          <w:color w:val="D97706"/>
+          <w:sz w:val="19"/>
+          <w:szCs w:val="19"/>
+        </w:rPr>
+        <w:t xml:space="preserve">TIPE: BENAR_SALAH</w:t>
+      </w:r>
+    </w:p>
+    <w:p>
+      <w:pPr>
         <w:spacing w:after="120"/>
       </w:pPr>
       <w:r>
@@ -556,59 +631,301 @@
           <w:sz w:val="21"/>
           <w:szCs w:val="21"/>
         </w:rPr>
-        <w:t xml:space="preserve">Organel sel yang berfungsi sebagai tempat respirasi seluler dan penghasil energi utama (ATP) adalah...</w:t>
-      </w:r>
-    </w:p>
-    <w:p>
-      <w:pPr>
-        <w:spacing w:after="60"/>
-      </w:pPr>
-      <w:r>
-        <w:rPr>
-          <w:rFonts w:ascii="Arial" w:cs="Arial" w:eastAsia="Arial" w:hAnsi="Arial"/>
-          <w:sz w:val="20"/>
-          <w:szCs w:val="20"/>
-        </w:rPr>
-        <w:t xml:space="preserve">A. Ribosom</w:t>
-      </w:r>
-    </w:p>
-    <w:p>
-      <w:pPr>
-        <w:spacing w:after="60"/>
-      </w:pPr>
-      <w:r>
-        <w:rPr>
-          <w:rFonts w:ascii="Arial" w:cs="Arial" w:eastAsia="Arial" w:hAnsi="Arial"/>
-          <w:sz w:val="20"/>
-          <w:szCs w:val="20"/>
-        </w:rPr>
-        <w:t xml:space="preserve">B. Mitokondria</w:t>
-      </w:r>
-    </w:p>
-    <w:p>
-      <w:pPr>
-        <w:spacing w:after="60"/>
-      </w:pPr>
-      <w:r>
-        <w:rPr>
-          <w:rFonts w:ascii="Arial" w:cs="Arial" w:eastAsia="Arial" w:hAnsi="Arial"/>
-          <w:sz w:val="20"/>
-          <w:szCs w:val="20"/>
-        </w:rPr>
-        <w:t xml:space="preserve">C. Retikulum Endoplasma</w:t>
-      </w:r>
-    </w:p>
-    <w:p>
-      <w:pPr>
-        <w:spacing w:after="60"/>
-      </w:pPr>
-      <w:r>
-        <w:rPr>
-          <w:rFonts w:ascii="Arial" w:cs="Arial" w:eastAsia="Arial" w:hAnsi="Arial"/>
-          <w:sz w:val="20"/>
-          <w:szCs w:val="20"/>
-        </w:rPr>
-        <w:t xml:space="preserve">D. Lisosom</w:t>
+        <w:t xml:space="preserve">Fotosintesis pada tumbuhan hijau menghasilkan gas oksigen dan senyawa glukosa.</w:t>
+      </w:r>
+    </w:p>
+    <w:p>
+      <w:pPr>
+        <w:spacing w:after="60"/>
+      </w:pPr>
+      <w:r>
+        <w:rPr>
+          <w:rFonts w:ascii="Arial" w:cs="Arial" w:eastAsia="Arial" w:hAnsi="Arial"/>
+          <w:b/>
+          <w:bCs/>
+          <w:color w:val="15803D"/>
+          <w:sz w:val="20"/>
+          <w:szCs w:val="20"/>
+        </w:rPr>
+        <w:t xml:space="preserve">KUNCI: </w:t>
+      </w:r>
+      <w:r>
+        <w:rPr>
+          <w:rFonts w:ascii="Arial" w:cs="Arial" w:eastAsia="Arial" w:hAnsi="Arial"/>
+          <w:b/>
+          <w:bCs/>
+          <w:color w:val="15803D"/>
+          <w:sz w:val="20"/>
+          <w:szCs w:val="20"/>
+        </w:rPr>
+        <w:t xml:space="preserve">BENAR</w:t>
+      </w:r>
+    </w:p>
+    <w:p>
+      <w:pPr>
+        <w:spacing w:after="60"/>
+      </w:pPr>
+      <w:r>
+        <w:rPr>
+          <w:rFonts w:ascii="Arial" w:cs="Arial" w:eastAsia="Arial" w:hAnsi="Arial"/>
+          <w:b/>
+          <w:bCs/>
+          <w:color w:val="475569"/>
+          <w:sz w:val="19"/>
+          <w:szCs w:val="19"/>
+        </w:rPr>
+        <w:t xml:space="preserve">PEMBAHASAN: </w:t>
+      </w:r>
+      <w:r>
+        <w:rPr>
+          <w:rFonts w:ascii="Arial" w:cs="Arial" w:eastAsia="Arial" w:hAnsi="Arial"/>
+          <w:color w:val="475569"/>
+          <w:sz w:val="19"/>
+          <w:szCs w:val="19"/>
+        </w:rPr>
+        <w:t xml:space="preserve">Reaksi fotosintesis: 6CO2 + 6H2O + cahaya -&gt; C6H12O6 + 6O2.</w:t>
+      </w:r>
+    </w:p>
+    <w:p>
+      <w:pPr>
+        <w:spacing w:after="260"/>
+      </w:pPr>
+      <w:r>
+        <w:rPr>
+          <w:rFonts w:ascii="Arial" w:cs="Arial" w:eastAsia="Arial" w:hAnsi="Arial"/>
+          <w:b/>
+          <w:bCs/>
+          <w:color w:val="475569"/>
+          <w:sz w:val="19"/>
+          <w:szCs w:val="19"/>
+        </w:rPr>
+        <w:t xml:space="preserve">KESULITAN: </w:t>
+      </w:r>
+      <w:r>
+        <w:rPr>
+          <w:rFonts w:ascii="Arial" w:cs="Arial" w:eastAsia="Arial" w:hAnsi="Arial"/>
+          <w:color w:val="475569"/>
+          <w:sz w:val="19"/>
+          <w:szCs w:val="19"/>
+        </w:rPr>
+        <w:t xml:space="preserve">MUDAH</w:t>
+      </w:r>
+    </w:p>
+    <w:p>
+      <w:pPr>
+        <w:spacing w:after="260"/>
+        <w:jc w:val="center"/>
+      </w:pPr>
+      <w:r>
+        <w:rPr>
+          <w:color w:val="CBD5E1"/>
+        </w:rPr>
+        <w:t xml:space="preserve">────────────────────────────────────────────────────────</w:t>
+      </w:r>
+    </w:p>
+    <w:p>
+      <w:pPr>
+        <w:spacing w:after="80" w:before="100"/>
+      </w:pPr>
+      <w:r>
+        <w:rPr>
+          <w:rFonts w:ascii="Arial" w:cs="Arial" w:eastAsia="Arial" w:hAnsi="Arial"/>
+          <w:b/>
+          <w:bCs/>
+          <w:color w:val="2563EB"/>
+          <w:sz w:val="22"/>
+          <w:szCs w:val="22"/>
+        </w:rPr>
+        <w:t xml:space="preserve">[SOAL 4]</w:t>
+      </w:r>
+    </w:p>
+    <w:p>
+      <w:pPr>
+        <w:spacing w:after="80"/>
+      </w:pPr>
+      <w:r>
+        <w:rPr>
+          <w:rFonts w:ascii="Arial" w:cs="Arial" w:eastAsia="Arial" w:hAnsi="Arial"/>
+          <w:b/>
+          <w:bCs/>
+          <w:color w:val="0891B2"/>
+          <w:sz w:val="19"/>
+          <w:szCs w:val="19"/>
+        </w:rPr>
+        <w:t xml:space="preserve">TIPE: ISIAN_SINGKAT</w:t>
+      </w:r>
+    </w:p>
+    <w:p>
+      <w:pPr>
+        <w:spacing w:after="120"/>
+      </w:pPr>
+      <w:r>
+        <w:rPr>
+          <w:rFonts w:ascii="Arial" w:cs="Arial" w:eastAsia="Arial" w:hAnsi="Arial"/>
+          <w:sz w:val="21"/>
+          <w:szCs w:val="21"/>
+        </w:rPr>
+        <w:t xml:space="preserve">Bahasa resmi yang digunakan oleh penduduk negara Brazil adalah...</w:t>
+      </w:r>
+    </w:p>
+    <w:p>
+      <w:pPr>
+        <w:spacing w:after="60"/>
+      </w:pPr>
+      <w:r>
+        <w:rPr>
+          <w:rFonts w:ascii="Arial" w:cs="Arial" w:eastAsia="Arial" w:hAnsi="Arial"/>
+          <w:b/>
+          <w:bCs/>
+          <w:color w:val="15803D"/>
+          <w:sz w:val="20"/>
+          <w:szCs w:val="20"/>
+        </w:rPr>
+        <w:t xml:space="preserve">KUNCI: </w:t>
+      </w:r>
+      <w:r>
+        <w:rPr>
+          <w:rFonts w:ascii="Arial" w:cs="Arial" w:eastAsia="Arial" w:hAnsi="Arial"/>
+          <w:b/>
+          <w:bCs/>
+          <w:color w:val="15803D"/>
+          <w:sz w:val="20"/>
+          <w:szCs w:val="20"/>
+        </w:rPr>
+        <w:t xml:space="preserve">Portugis, portugis, Portuguese</w:t>
+      </w:r>
+    </w:p>
+    <w:p>
+      <w:pPr>
+        <w:spacing w:after="60"/>
+      </w:pPr>
+      <w:r>
+        <w:rPr>
+          <w:rFonts w:ascii="Arial" w:cs="Arial" w:eastAsia="Arial" w:hAnsi="Arial"/>
+          <w:b/>
+          <w:bCs/>
+          <w:color w:val="475569"/>
+          <w:sz w:val="19"/>
+          <w:szCs w:val="19"/>
+        </w:rPr>
+        <w:t xml:space="preserve">PEMBAHASAN: </w:t>
+      </w:r>
+      <w:r>
+        <w:rPr>
+          <w:rFonts w:ascii="Arial" w:cs="Arial" w:eastAsia="Arial" w:hAnsi="Arial"/>
+          <w:color w:val="475569"/>
+          <w:sz w:val="19"/>
+          <w:szCs w:val="19"/>
+        </w:rPr>
+        <w:t xml:space="preserve">Brazil dijajah oleh Portugal sehingga bahasa resminya adalah bahasa Portugis.</w:t>
+      </w:r>
+    </w:p>
+    <w:p>
+      <w:pPr>
+        <w:spacing w:after="260"/>
+      </w:pPr>
+      <w:r>
+        <w:rPr>
+          <w:rFonts w:ascii="Arial" w:cs="Arial" w:eastAsia="Arial" w:hAnsi="Arial"/>
+          <w:b/>
+          <w:bCs/>
+          <w:color w:val="475569"/>
+          <w:sz w:val="19"/>
+          <w:szCs w:val="19"/>
+        </w:rPr>
+        <w:t xml:space="preserve">KESULITAN: </w:t>
+      </w:r>
+      <w:r>
+        <w:rPr>
+          <w:rFonts w:ascii="Arial" w:cs="Arial" w:eastAsia="Arial" w:hAnsi="Arial"/>
+          <w:color w:val="475569"/>
+          <w:sz w:val="19"/>
+          <w:szCs w:val="19"/>
+        </w:rPr>
+        <w:t xml:space="preserve">SEDANG</w:t>
+      </w:r>
+    </w:p>
+    <w:p>
+      <w:pPr>
+        <w:spacing w:after="260"/>
+        <w:jc w:val="center"/>
+      </w:pPr>
+      <w:r>
+        <w:rPr>
+          <w:color w:val="CBD5E1"/>
+        </w:rPr>
+        <w:t xml:space="preserve">────────────────────────────────────────────────────────</w:t>
+      </w:r>
+    </w:p>
+    <w:p>
+      <w:pPr>
+        <w:spacing w:after="80" w:before="100"/>
+      </w:pPr>
+      <w:r>
+        <w:rPr>
+          <w:rFonts w:ascii="Arial" w:cs="Arial" w:eastAsia="Arial" w:hAnsi="Arial"/>
+          <w:b/>
+          <w:bCs/>
+          <w:color w:val="2563EB"/>
+          <w:sz w:val="22"/>
+          <w:szCs w:val="22"/>
+        </w:rPr>
+        <w:t xml:space="preserve">[SOAL 5]</w:t>
+      </w:r>
+    </w:p>
+    <w:p>
+      <w:pPr>
+        <w:spacing w:after="80"/>
+      </w:pPr>
+      <w:r>
+        <w:rPr>
+          <w:rFonts w:ascii="Arial" w:cs="Arial" w:eastAsia="Arial" w:hAnsi="Arial"/>
+          <w:b/>
+          <w:bCs/>
+          <w:color w:val="4F46E5"/>
+          <w:sz w:val="19"/>
+          <w:szCs w:val="19"/>
+        </w:rPr>
+        <w:t xml:space="preserve">TIPE: MENJODOHKAN</w:t>
+      </w:r>
+    </w:p>
+    <w:p>
+      <w:pPr>
+        <w:spacing w:after="120"/>
+      </w:pPr>
+      <w:r>
+        <w:rPr>
+          <w:rFonts w:ascii="Arial" w:cs="Arial" w:eastAsia="Arial" w:hAnsi="Arial"/>
+          <w:sz w:val="21"/>
+          <w:szCs w:val="21"/>
+        </w:rPr>
+        <w:t xml:space="preserve">Jodohkanlah nama pahlawan nasional berikut dengan kota asalnya:</w:t>
+      </w:r>
+    </w:p>
+    <w:p>
+      <w:pPr>
+        <w:spacing w:after="60"/>
+      </w:pPr>
+      <w:r>
+        <w:rPr>
+          <w:rFonts w:ascii="Arial" w:cs="Arial" w:eastAsia="Arial" w:hAnsi="Arial"/>
+          <w:sz w:val="20"/>
+          <w:szCs w:val="20"/>
+        </w:rPr>
+        <w:t xml:space="preserve">A. R.A. Kartini -&gt; Jepara</w:t>
+      </w:r>
+    </w:p>
+    <w:p>
+      <w:pPr>
+        <w:spacing w:after="60"/>
+      </w:pPr>
+      <w:r>
+        <w:rPr>
+          <w:rFonts w:ascii="Arial" w:cs="Arial" w:eastAsia="Arial" w:hAnsi="Arial"/>
+          <w:sz w:val="20"/>
+          <w:szCs w:val="20"/>
+        </w:rPr>
+        <w:t xml:space="preserve">B. Pangeran Diponegoro -&gt; Yogyakarta</w:t>
       </w:r>
     </w:p>
     <w:p>
@@ -621,34 +938,7 @@
           <w:sz w:val="20"/>
           <w:szCs w:val="20"/>
         </w:rPr>
-        <w:t xml:space="preserve">E. Badan Golgi</w:t>
-      </w:r>
-    </w:p>
-    <w:p>
-      <w:pPr>
-        <w:spacing w:after="60"/>
-      </w:pPr>
-      <w:r>
-        <w:rPr>
-          <w:rFonts w:ascii="Arial" w:cs="Arial" w:eastAsia="Arial" w:hAnsi="Arial"/>
-          <w:b/>
-          <w:bCs/>
-          <w:color w:val="15803D"/>
-          <w:sz w:val="20"/>
-          <w:szCs w:val="20"/>
-        </w:rPr>
-        <w:t xml:space="preserve">KUNCI: </w:t>
-      </w:r>
-      <w:r>
-        <w:rPr>
-          <w:rFonts w:ascii="Arial" w:cs="Arial" w:eastAsia="Arial" w:hAnsi="Arial"/>
-          <w:b/>
-          <w:bCs/>
-          <w:color w:val="15803D"/>
-          <w:sz w:val="20"/>
-          <w:szCs w:val="20"/>
-        </w:rPr>
-        <w:t xml:space="preserve">B</w:t>
+        <w:t xml:space="preserve">C. Cut Nyak Dien -&gt; Aceh</w:t>
       </w:r>
     </w:p>
     <w:p>
@@ -673,7 +963,114 @@
           <w:sz w:val="19"/>
           <w:szCs w:val="19"/>
         </w:rPr>
-        <w:t xml:space="preserve">Mitokondria merupakan penghasil energi terbesar di dalam sel melalui respirasi aerobik.</w:t>
+        <w:t xml:space="preserve">Kartini berasal dari Jepara, Diponegoro berjuang di Yogyakarta, dan Cut Nyak Dien dari Aceh.</w:t>
+      </w:r>
+    </w:p>
+    <w:p>
+      <w:pPr>
+        <w:spacing w:after="260"/>
+      </w:pPr>
+      <w:r>
+        <w:rPr>
+          <w:rFonts w:ascii="Arial" w:cs="Arial" w:eastAsia="Arial" w:hAnsi="Arial"/>
+          <w:b/>
+          <w:bCs/>
+          <w:color w:val="475569"/>
+          <w:sz w:val="19"/>
+          <w:szCs w:val="19"/>
+        </w:rPr>
+        <w:t xml:space="preserve">KESULITAN: </w:t>
+      </w:r>
+      <w:r>
+        <w:rPr>
+          <w:rFonts w:ascii="Arial" w:cs="Arial" w:eastAsia="Arial" w:hAnsi="Arial"/>
+          <w:color w:val="475569"/>
+          <w:sz w:val="19"/>
+          <w:szCs w:val="19"/>
+        </w:rPr>
+        <w:t xml:space="preserve">SULIT</w:t>
+      </w:r>
+    </w:p>
+    <w:p>
+      <w:pPr>
+        <w:spacing w:after="260"/>
+        <w:jc w:val="center"/>
+      </w:pPr>
+      <w:r>
+        <w:rPr>
+          <w:color w:val="CBD5E1"/>
+        </w:rPr>
+        <w:t xml:space="preserve">────────────────────────────────────────────────────────</w:t>
+      </w:r>
+    </w:p>
+    <w:p>
+      <w:pPr>
+        <w:spacing w:after="80" w:before="100"/>
+      </w:pPr>
+      <w:r>
+        <w:rPr>
+          <w:rFonts w:ascii="Arial" w:cs="Arial" w:eastAsia="Arial" w:hAnsi="Arial"/>
+          <w:b/>
+          <w:bCs/>
+          <w:color w:val="2563EB"/>
+          <w:sz w:val="22"/>
+          <w:szCs w:val="22"/>
+        </w:rPr>
+        <w:t xml:space="preserve">[SOAL 6]</w:t>
+      </w:r>
+    </w:p>
+    <w:p>
+      <w:pPr>
+        <w:spacing w:after="80"/>
+      </w:pPr>
+      <w:r>
+        <w:rPr>
+          <w:rFonts w:ascii="Arial" w:cs="Arial" w:eastAsia="Arial" w:hAnsi="Arial"/>
+          <w:b/>
+          <w:bCs/>
+          <w:color w:val="E11D48"/>
+          <w:sz w:val="19"/>
+          <w:szCs w:val="19"/>
+        </w:rPr>
+        <w:t xml:space="preserve">TIPE: ESAI</w:t>
+      </w:r>
+    </w:p>
+    <w:p>
+      <w:pPr>
+        <w:spacing w:after="120"/>
+      </w:pPr>
+      <w:r>
+        <w:rPr>
+          <w:rFonts w:ascii="Arial" w:cs="Arial" w:eastAsia="Arial" w:hAnsi="Arial"/>
+          <w:sz w:val="21"/>
+          <w:szCs w:val="21"/>
+        </w:rPr>
+        <w:t xml:space="preserve">Jelaskan perbedaan mendasar antara siklus lisogenik dan siklus litik pada proses replikasi virus!</w:t>
+      </w:r>
+    </w:p>
+    <w:p>
+      <w:pPr>
+        <w:spacing w:after="60"/>
+      </w:pPr>
+      <w:r>
+        <w:rPr>
+          <w:rFonts w:ascii="Arial" w:cs="Arial" w:eastAsia="Arial" w:hAnsi="Arial"/>
+          <w:b/>
+          <w:bCs/>
+          <w:color w:val="475569"/>
+          <w:sz w:val="19"/>
+          <w:szCs w:val="19"/>
+        </w:rPr>
+        <w:t xml:space="preserve">PEMBAHASAN: </w:t>
+      </w:r>
+      <w:r>
+        <w:rPr>
+          <w:rFonts w:ascii="Arial" w:cs="Arial" w:eastAsia="Arial" w:hAnsi="Arial"/>
+          <w:color w:val="475569"/>
+          <w:sz w:val="19"/>
+          <w:szCs w:val="19"/>
+        </w:rPr>
+        <w:t xml:space="preserve">Siklus litik menghancurkan/melisiskan sel inang segera setelah proses perakitan virus baru, sedangkan siklus lisogenik menyisipkan materi genetik virus ke dalam genom sel inang tanpa langsung mematikan sel.</w:t>
       </w:r>
     </w:p>
     <w:p>
@@ -698,7 +1095,7 @@
           <w:sz w:val="19"/>
           <w:szCs w:val="19"/>
         </w:rPr>
-        <w:t xml:space="preserve">SEDANG</w:t>
+        <w:t xml:space="preserve">SULIT</w:t>
       </w:r>
     </w:p>
     <w:sectPr>

</xml_diff>